<commit_message>
TC-58: refactoring/create documents for tests
</commit_message>
<xml_diff>
--- a/java-thesis-checker/src/test/resources/correct_structural_element_location.docx
+++ b/java-thesis-checker/src/test/resources/correct_structural_element_location.docx
@@ -3,91 +3,162 @@
 <w:document xmlns:wpc="http://schemas.microsoft.com/office/word/2010/wordprocessingCanvas" xmlns:cx="http://schemas.microsoft.com/office/drawing/2014/chartex" xmlns:cx1="http://schemas.microsoft.com/office/drawing/2015/9/8/chartex" xmlns:cx2="http://schemas.microsoft.com/office/drawing/2015/10/21/chartex" xmlns:cx3="http://schemas.microsoft.com/office/drawing/2016/5/9/chartex" xmlns:cx4="http://schemas.microsoft.com/office/drawing/2016/5/10/chartex" xmlns:cx5="http://schemas.microsoft.com/office/drawing/2016/5/11/chartex" xmlns:cx6="http://schemas.microsoft.com/office/drawing/2016/5/12/chartex" xmlns:cx7="http://schemas.microsoft.com/office/drawing/2016/5/13/chartex" xmlns:cx8="http://schemas.microsoft.com/office/drawing/2016/5/14/chartex" xmlns:mc="http://schemas.openxmlformats.org/markup-compatibility/2006" xmlns:aink="http://schemas.microsoft.com/office/drawing/2016/ink" xmlns:am3d="http://schemas.microsoft.com/office/drawing/2017/model3d" xmlns:o="urn:schemas-microsoft-com:office:office" xmlns:oel="http://schemas.microsoft.com/office/2019/extlst" xmlns:r="http://schemas.openxmlformats.org/officeDocument/2006/relationships" xmlns:m="http://schemas.openxmlformats.org/officeDocument/2006/math" xmlns:v="urn:schemas-microsoft-com:vml" xmlns:wp14="http://schemas.microsoft.com/office/word/2010/wordprocessingDrawing" xmlns:wp="http://schemas.openxmlformats.org/drawingml/2006/wordprocessingDrawing" xmlns:w10="urn:schemas-microsoft-com:office:word" xmlns:w="http://schemas.openxmlformats.org/wordprocessingml/2006/main" xmlns:w14="http://schemas.microsoft.com/office/word/2010/wordml" xmlns:w15="http://schemas.microsoft.com/office/word/2012/wordml" xmlns:w16cex="http://schemas.microsoft.com/office/word/2018/wordml/cex" xmlns:w16cid="http://schemas.microsoft.com/office/word/2016/wordml/cid" xmlns:w16="http://schemas.microsoft.com/office/word/2018/wordml" xmlns:w16du="http://schemas.microsoft.com/office/word/2023/wordml/word16du" xmlns:w16sdtdh="http://schemas.microsoft.com/office/word/2020/wordml/sdtdatahash" xmlns:w16sdtfl="http://schemas.microsoft.com/office/word/2024/wordml/sdtformatlock" xmlns:w16se="http://schemas.microsoft.com/office/word/2015/wordml/symex" xmlns:wpg="http://schemas.microsoft.com/office/word/2010/wordprocessingGroup" xmlns:wpi="http://schemas.microsoft.com/office/word/2010/wordprocessingInk" xmlns:wne="http://schemas.microsoft.com/office/word/2006/wordml" xmlns:wps="http://schemas.microsoft.com/office/word/2010/wordprocessingShape" mc:Ignorable="w14 w15 w16se w16cid w16 w16cex w16sdtdh w16sdtfl w16du wp14">
   <w:body>
     <w:p>
+      <w:pPr>
+        <w:jc w:val="center"/>
+        <w:rPr>
+          <w:b/>
+          <w:bCs/>
+        </w:rPr>
+      </w:pPr>
       <w:r>
-        <w:t xml:space="preserve">РЕФЕРАТ</w:t>
+        <w:rPr>
+          <w:b/>
+          <w:bCs/>
+        </w:rPr>
+        <w:t>РЕФЕРАТ</w:t>
       </w:r>
     </w:p>
     <w:p>
       <w:r>
-        <w:t xml:space="preserve">Стислий виклад роботи та її результатів.</w:t>
+        <w:t>Стислий виклад роботи та її результатів.</w:t>
       </w:r>
     </w:p>
     <w:p>
       <w:pPr>
         <w:pageBreakBefore/>
+        <w:jc w:val="center"/>
+        <w:rPr>
+          <w:b/>
+          <w:bCs/>
+        </w:rPr>
       </w:pPr>
       <w:r>
-        <w:t xml:space="preserve">ЗМІСТ</w:t>
+        <w:rPr>
+          <w:b/>
+          <w:bCs/>
+        </w:rPr>
+        <w:lastRenderedPageBreak/>
+        <w:t>ЗМІСТ</w:t>
       </w:r>
     </w:p>
     <w:p>
       <w:r>
-        <w:t xml:space="preserve">1. Вступ ... 2. Основна частина ... 3. Висновки ...</w:t>
+        <w:t>1. Вступ ... 2. Основна частина ... 3. Висновки ...</w:t>
       </w:r>
     </w:p>
     <w:p>
       <w:pPr>
         <w:pageBreakBefore/>
+        <w:jc w:val="center"/>
+        <w:rPr>
+          <w:b/>
+          <w:bCs/>
+        </w:rPr>
       </w:pPr>
       <w:r>
-        <w:t xml:space="preserve">ПЕРЕЛІК ПОЗНАК ТА СКОРОЧЕНЬ</w:t>
+        <w:rPr>
+          <w:b/>
+          <w:bCs/>
+        </w:rPr>
+        <w:lastRenderedPageBreak/>
+        <w:t>ПЕРЕЛІК ПОЗНАК ТА СКОРОЧЕНЬ</w:t>
       </w:r>
     </w:p>
     <w:p>
       <w:r>
-        <w:t xml:space="preserve">ПК – персональний комп'ютер.</w:t>
+        <w:t>ПК – персональний комп'ютер.</w:t>
       </w:r>
     </w:p>
     <w:p>
       <w:pPr>
         <w:pageBreakBefore/>
+        <w:jc w:val="center"/>
+        <w:rPr>
+          <w:b/>
+          <w:bCs/>
+        </w:rPr>
       </w:pPr>
       <w:r>
-        <w:t xml:space="preserve">ВСТУП</w:t>
+        <w:rPr>
+          <w:b/>
+          <w:bCs/>
+        </w:rPr>
+        <w:lastRenderedPageBreak/>
+        <w:t>ВСТУП</w:t>
       </w:r>
     </w:p>
     <w:p>
       <w:r>
-        <w:t xml:space="preserve">Актуальність теми роботи полягає у ...</w:t>
+        <w:t>Актуальність теми роботи полягає у ...</w:t>
       </w:r>
     </w:p>
     <w:p>
       <w:pPr>
         <w:pageBreakBefore/>
+        <w:jc w:val="center"/>
+        <w:rPr>
+          <w:b/>
+          <w:bCs/>
+        </w:rPr>
       </w:pPr>
       <w:r>
-        <w:t xml:space="preserve">ВИСНОВКИ</w:t>
+        <w:rPr>
+          <w:b/>
+          <w:bCs/>
+        </w:rPr>
+        <w:lastRenderedPageBreak/>
+        <w:t>ВИСНОВКИ</w:t>
       </w:r>
     </w:p>
     <w:p>
       <w:r>
-        <w:t xml:space="preserve">У результаті виконання роботи отримано ...</w:t>
+        <w:t>У результаті виконання роботи отримано ...</w:t>
       </w:r>
     </w:p>
     <w:p>
       <w:pPr>
         <w:pageBreakBefore/>
+        <w:jc w:val="center"/>
+        <w:rPr>
+          <w:b/>
+          <w:bCs/>
+        </w:rPr>
       </w:pPr>
       <w:r>
-        <w:t xml:space="preserve">СПИСОК ДЖЕРЕЛ ІНФОРМАЦІЇ</w:t>
+        <w:rPr>
+          <w:b/>
+          <w:bCs/>
+        </w:rPr>
+        <w:lastRenderedPageBreak/>
+        <w:t>СПИСОК ДЖЕРЕЛ ІНФОРМАЦІЇ</w:t>
       </w:r>
     </w:p>
     <w:p>
       <w:r>
-        <w:t xml:space="preserve">1. Автор. Назва джерела. Рік видання.</w:t>
+        <w:t>1. Автор. Назва джерела. Рік видання.</w:t>
       </w:r>
     </w:p>
     <w:p>
       <w:pPr>
         <w:pageBreakBefore/>
+        <w:jc w:val="center"/>
+        <w:rPr>
+          <w:b/>
+          <w:bCs/>
+        </w:rPr>
       </w:pPr>
       <w:r>
-        <w:t xml:space="preserve">ДОДАТОК А</w:t>
+        <w:rPr>
+          <w:b/>
+          <w:bCs/>
+        </w:rPr>
+        <w:lastRenderedPageBreak/>
+        <w:t>ДОДАТОК А</w:t>
       </w:r>
     </w:p>
     <w:p>
       <w:r>
-        <w:t xml:space="preserve">Текст додатка А.</w:t>
+        <w:t>Текст додатка А.</w:t>
       </w:r>
     </w:p>
     <w:sectPr>
@@ -109,7 +180,7 @@
         <w:kern w:val="2"/>
         <w:sz w:val="24"/>
         <w:szCs w:val="24"/>
-        <w:lang w:val="ru-UA" w:eastAsia="en-US" w:bidi="ar-SA"/>
+        <w:lang w:val="en-UA" w:eastAsia="en-US" w:bidi="ar-SA"/>
         <w14:ligatures w14:val="standardContextual"/>
       </w:rPr>
     </w:rPrDefault>
@@ -497,15 +568,15 @@
     <w:lsdException w:name="Unresolved Mention" w:semiHidden="1" w:unhideWhenUsed="1"/>
     <w:lsdException w:name="Smart Link" w:semiHidden="1" w:unhideWhenUsed="1"/>
   </w:latentStyles>
-  <w:style w:type="paragraph" w:default="1" w:styleId="a">
+  <w:style w:type="paragraph" w:default="1" w:styleId="Normal">
     <w:name w:val="Normal"/>
     <w:qFormat/>
   </w:style>
-  <w:style w:type="paragraph" w:styleId="1">
+  <w:style w:type="paragraph" w:styleId="Heading1">
     <w:name w:val="heading 1"/>
-    <w:basedOn w:val="a0"/>
-    <w:next w:val="a"/>
-    <w:link w:val="10"/>
+    <w:basedOn w:val="NoSpacing"/>
+    <w:next w:val="Normal"/>
+    <w:link w:val="Heading1Char"/>
     <w:uiPriority w:val="9"/>
     <w:qFormat/>
     <w:rsid w:val="00C057C7"/>
@@ -522,11 +593,11 @@
       <w:szCs w:val="40"/>
     </w:rPr>
   </w:style>
-  <w:style w:type="paragraph" w:styleId="2">
+  <w:style w:type="paragraph" w:styleId="Heading2">
     <w:name w:val="heading 2"/>
-    <w:basedOn w:val="a"/>
-    <w:next w:val="a"/>
-    <w:link w:val="20"/>
+    <w:basedOn w:val="Normal"/>
+    <w:next w:val="Normal"/>
+    <w:link w:val="Heading2Char"/>
     <w:uiPriority w:val="9"/>
     <w:semiHidden/>
     <w:unhideWhenUsed/>
@@ -545,11 +616,11 @@
       <w:szCs w:val="32"/>
     </w:rPr>
   </w:style>
-  <w:style w:type="paragraph" w:styleId="3">
+  <w:style w:type="paragraph" w:styleId="Heading3">
     <w:name w:val="heading 3"/>
-    <w:basedOn w:val="a"/>
-    <w:next w:val="a"/>
-    <w:link w:val="30"/>
+    <w:basedOn w:val="Normal"/>
+    <w:next w:val="Normal"/>
+    <w:link w:val="Heading3Char"/>
     <w:uiPriority w:val="9"/>
     <w:semiHidden/>
     <w:unhideWhenUsed/>
@@ -568,11 +639,11 @@
       <w:szCs w:val="28"/>
     </w:rPr>
   </w:style>
-  <w:style w:type="paragraph" w:styleId="4">
+  <w:style w:type="paragraph" w:styleId="Heading4">
     <w:name w:val="heading 4"/>
-    <w:basedOn w:val="a"/>
-    <w:next w:val="a"/>
-    <w:link w:val="40"/>
+    <w:basedOn w:val="Normal"/>
+    <w:next w:val="Normal"/>
+    <w:link w:val="Heading4Char"/>
     <w:uiPriority w:val="9"/>
     <w:semiHidden/>
     <w:unhideWhenUsed/>
@@ -591,11 +662,11 @@
       <w:color w:val="0F4761" w:themeColor="accent1" w:themeShade="BF"/>
     </w:rPr>
   </w:style>
-  <w:style w:type="paragraph" w:styleId="5">
+  <w:style w:type="paragraph" w:styleId="Heading5">
     <w:name w:val="heading 5"/>
-    <w:basedOn w:val="a"/>
-    <w:next w:val="a"/>
-    <w:link w:val="50"/>
+    <w:basedOn w:val="Normal"/>
+    <w:next w:val="Normal"/>
+    <w:link w:val="Heading5Char"/>
     <w:uiPriority w:val="9"/>
     <w:semiHidden/>
     <w:unhideWhenUsed/>
@@ -612,11 +683,11 @@
       <w:color w:val="0F4761" w:themeColor="accent1" w:themeShade="BF"/>
     </w:rPr>
   </w:style>
-  <w:style w:type="paragraph" w:styleId="6">
+  <w:style w:type="paragraph" w:styleId="Heading6">
     <w:name w:val="heading 6"/>
-    <w:basedOn w:val="a"/>
-    <w:next w:val="a"/>
-    <w:link w:val="60"/>
+    <w:basedOn w:val="Normal"/>
+    <w:next w:val="Normal"/>
+    <w:link w:val="Heading6Char"/>
     <w:uiPriority w:val="9"/>
     <w:semiHidden/>
     <w:unhideWhenUsed/>
@@ -635,11 +706,11 @@
       <w:color w:val="595959" w:themeColor="text1" w:themeTint="A6"/>
     </w:rPr>
   </w:style>
-  <w:style w:type="paragraph" w:styleId="7">
+  <w:style w:type="paragraph" w:styleId="Heading7">
     <w:name w:val="heading 7"/>
-    <w:basedOn w:val="a"/>
-    <w:next w:val="a"/>
-    <w:link w:val="70"/>
+    <w:basedOn w:val="Normal"/>
+    <w:next w:val="Normal"/>
+    <w:link w:val="Heading7Char"/>
     <w:uiPriority w:val="9"/>
     <w:semiHidden/>
     <w:unhideWhenUsed/>
@@ -656,11 +727,11 @@
       <w:color w:val="595959" w:themeColor="text1" w:themeTint="A6"/>
     </w:rPr>
   </w:style>
-  <w:style w:type="paragraph" w:styleId="8">
+  <w:style w:type="paragraph" w:styleId="Heading8">
     <w:name w:val="heading 8"/>
-    <w:basedOn w:val="a"/>
-    <w:next w:val="a"/>
-    <w:link w:val="80"/>
+    <w:basedOn w:val="Normal"/>
+    <w:next w:val="Normal"/>
+    <w:link w:val="Heading8Char"/>
     <w:uiPriority w:val="9"/>
     <w:semiHidden/>
     <w:unhideWhenUsed/>
@@ -679,11 +750,11 @@
       <w:color w:val="272727" w:themeColor="text1" w:themeTint="D8"/>
     </w:rPr>
   </w:style>
-  <w:style w:type="paragraph" w:styleId="9">
+  <w:style w:type="paragraph" w:styleId="Heading9">
     <w:name w:val="heading 9"/>
-    <w:basedOn w:val="a"/>
-    <w:next w:val="a"/>
-    <w:link w:val="90"/>
+    <w:basedOn w:val="Normal"/>
+    <w:next w:val="Normal"/>
+    <w:link w:val="Heading9Char"/>
     <w:uiPriority w:val="9"/>
     <w:semiHidden/>
     <w:unhideWhenUsed/>
@@ -700,13 +771,13 @@
       <w:color w:val="272727" w:themeColor="text1" w:themeTint="D8"/>
     </w:rPr>
   </w:style>
-  <w:style w:type="character" w:default="1" w:styleId="a1">
+  <w:style w:type="character" w:default="1" w:styleId="DefaultParagraphFont">
     <w:name w:val="Default Paragraph Font"/>
     <w:uiPriority w:val="1"/>
     <w:semiHidden/>
     <w:unhideWhenUsed/>
   </w:style>
-  <w:style w:type="table" w:default="1" w:styleId="a2">
+  <w:style w:type="table" w:default="1" w:styleId="TableNormal">
     <w:name w:val="Normal Table"/>
     <w:uiPriority w:val="99"/>
     <w:semiHidden/>
@@ -721,16 +792,16 @@
       </w:tblCellMar>
     </w:tblPr>
   </w:style>
-  <w:style w:type="numbering" w:default="1" w:styleId="a3">
+  <w:style w:type="numbering" w:default="1" w:styleId="NoList">
     <w:name w:val="No List"/>
     <w:uiPriority w:val="99"/>
     <w:semiHidden/>
     <w:unhideWhenUsed/>
   </w:style>
-  <w:style w:type="character" w:customStyle="1" w:styleId="10">
-    <w:name w:val="Заголовок 1 Знак"/>
-    <w:basedOn w:val="a1"/>
-    <w:link w:val="1"/>
+  <w:style w:type="character" w:customStyle="1" w:styleId="Heading1Char">
+    <w:name w:val="Heading 1 Char"/>
+    <w:basedOn w:val="DefaultParagraphFont"/>
+    <w:link w:val="Heading1"/>
     <w:uiPriority w:val="9"/>
     <w:rsid w:val="00C057C7"/>
     <w:rPr>
@@ -740,10 +811,10 @@
       <w:szCs w:val="40"/>
     </w:rPr>
   </w:style>
-  <w:style w:type="character" w:customStyle="1" w:styleId="20">
-    <w:name w:val="Заголовок 2 Знак"/>
-    <w:basedOn w:val="a1"/>
-    <w:link w:val="2"/>
+  <w:style w:type="character" w:customStyle="1" w:styleId="Heading2Char">
+    <w:name w:val="Heading 2 Char"/>
+    <w:basedOn w:val="DefaultParagraphFont"/>
+    <w:link w:val="Heading2"/>
     <w:uiPriority w:val="9"/>
     <w:semiHidden/>
     <w:rsid w:val="00C057C7"/>
@@ -754,10 +825,10 @@
       <w:szCs w:val="32"/>
     </w:rPr>
   </w:style>
-  <w:style w:type="character" w:customStyle="1" w:styleId="30">
-    <w:name w:val="Заголовок 3 Знак"/>
-    <w:basedOn w:val="a1"/>
-    <w:link w:val="3"/>
+  <w:style w:type="character" w:customStyle="1" w:styleId="Heading3Char">
+    <w:name w:val="Heading 3 Char"/>
+    <w:basedOn w:val="DefaultParagraphFont"/>
+    <w:link w:val="Heading3"/>
     <w:uiPriority w:val="9"/>
     <w:semiHidden/>
     <w:rsid w:val="00C057C7"/>
@@ -768,10 +839,10 @@
       <w:szCs w:val="28"/>
     </w:rPr>
   </w:style>
-  <w:style w:type="character" w:customStyle="1" w:styleId="40">
-    <w:name w:val="Заголовок 4 Знак"/>
-    <w:basedOn w:val="a1"/>
-    <w:link w:val="4"/>
+  <w:style w:type="character" w:customStyle="1" w:styleId="Heading4Char">
+    <w:name w:val="Heading 4 Char"/>
+    <w:basedOn w:val="DefaultParagraphFont"/>
+    <w:link w:val="Heading4"/>
     <w:uiPriority w:val="9"/>
     <w:semiHidden/>
     <w:rsid w:val="00C057C7"/>
@@ -782,10 +853,10 @@
       <w:color w:val="0F4761" w:themeColor="accent1" w:themeShade="BF"/>
     </w:rPr>
   </w:style>
-  <w:style w:type="character" w:customStyle="1" w:styleId="50">
-    <w:name w:val="Заголовок 5 Знак"/>
-    <w:basedOn w:val="a1"/>
-    <w:link w:val="5"/>
+  <w:style w:type="character" w:customStyle="1" w:styleId="Heading5Char">
+    <w:name w:val="Heading 5 Char"/>
+    <w:basedOn w:val="DefaultParagraphFont"/>
+    <w:link w:val="Heading5"/>
     <w:uiPriority w:val="9"/>
     <w:semiHidden/>
     <w:rsid w:val="00C057C7"/>
@@ -794,10 +865,10 @@
       <w:color w:val="0F4761" w:themeColor="accent1" w:themeShade="BF"/>
     </w:rPr>
   </w:style>
-  <w:style w:type="character" w:customStyle="1" w:styleId="60">
-    <w:name w:val="Заголовок 6 Знак"/>
-    <w:basedOn w:val="a1"/>
-    <w:link w:val="6"/>
+  <w:style w:type="character" w:customStyle="1" w:styleId="Heading6Char">
+    <w:name w:val="Heading 6 Char"/>
+    <w:basedOn w:val="DefaultParagraphFont"/>
+    <w:link w:val="Heading6"/>
     <w:uiPriority w:val="9"/>
     <w:semiHidden/>
     <w:rsid w:val="00C057C7"/>
@@ -808,10 +879,10 @@
       <w:color w:val="595959" w:themeColor="text1" w:themeTint="A6"/>
     </w:rPr>
   </w:style>
-  <w:style w:type="character" w:customStyle="1" w:styleId="70">
-    <w:name w:val="Заголовок 7 Знак"/>
-    <w:basedOn w:val="a1"/>
-    <w:link w:val="7"/>
+  <w:style w:type="character" w:customStyle="1" w:styleId="Heading7Char">
+    <w:name w:val="Heading 7 Char"/>
+    <w:basedOn w:val="DefaultParagraphFont"/>
+    <w:link w:val="Heading7"/>
     <w:uiPriority w:val="9"/>
     <w:semiHidden/>
     <w:rsid w:val="00C057C7"/>
@@ -820,10 +891,10 @@
       <w:color w:val="595959" w:themeColor="text1" w:themeTint="A6"/>
     </w:rPr>
   </w:style>
-  <w:style w:type="character" w:customStyle="1" w:styleId="80">
-    <w:name w:val="Заголовок 8 Знак"/>
-    <w:basedOn w:val="a1"/>
-    <w:link w:val="8"/>
+  <w:style w:type="character" w:customStyle="1" w:styleId="Heading8Char">
+    <w:name w:val="Heading 8 Char"/>
+    <w:basedOn w:val="DefaultParagraphFont"/>
+    <w:link w:val="Heading8"/>
     <w:uiPriority w:val="9"/>
     <w:semiHidden/>
     <w:rsid w:val="00C057C7"/>
@@ -834,10 +905,10 @@
       <w:color w:val="272727" w:themeColor="text1" w:themeTint="D8"/>
     </w:rPr>
   </w:style>
-  <w:style w:type="character" w:customStyle="1" w:styleId="90">
-    <w:name w:val="Заголовок 9 Знак"/>
-    <w:basedOn w:val="a1"/>
-    <w:link w:val="9"/>
+  <w:style w:type="character" w:customStyle="1" w:styleId="Heading9Char">
+    <w:name w:val="Heading 9 Char"/>
+    <w:basedOn w:val="DefaultParagraphFont"/>
+    <w:link w:val="Heading9"/>
     <w:uiPriority w:val="9"/>
     <w:semiHidden/>
     <w:rsid w:val="00C057C7"/>
@@ -846,11 +917,11 @@
       <w:color w:val="272727" w:themeColor="text1" w:themeTint="D8"/>
     </w:rPr>
   </w:style>
-  <w:style w:type="paragraph" w:styleId="a4">
+  <w:style w:type="paragraph" w:styleId="Title">
     <w:name w:val="Title"/>
-    <w:basedOn w:val="a"/>
-    <w:next w:val="a"/>
-    <w:link w:val="a5"/>
+    <w:basedOn w:val="Normal"/>
+    <w:next w:val="Normal"/>
+    <w:link w:val="TitleChar"/>
     <w:uiPriority w:val="10"/>
     <w:qFormat/>
     <w:rsid w:val="00C057C7"/>
@@ -866,10 +937,10 @@
       <w:szCs w:val="56"/>
     </w:rPr>
   </w:style>
-  <w:style w:type="character" w:customStyle="1" w:styleId="a5">
-    <w:name w:val="Заголовок Знак"/>
-    <w:basedOn w:val="a1"/>
-    <w:link w:val="a4"/>
+  <w:style w:type="character" w:customStyle="1" w:styleId="TitleChar">
+    <w:name w:val="Title Char"/>
+    <w:basedOn w:val="DefaultParagraphFont"/>
+    <w:link w:val="Title"/>
     <w:uiPriority w:val="10"/>
     <w:rsid w:val="00C057C7"/>
     <w:rPr>
@@ -880,11 +951,11 @@
       <w:szCs w:val="56"/>
     </w:rPr>
   </w:style>
-  <w:style w:type="paragraph" w:styleId="a6">
+  <w:style w:type="paragraph" w:styleId="Subtitle">
     <w:name w:val="Subtitle"/>
-    <w:basedOn w:val="a"/>
-    <w:next w:val="a"/>
-    <w:link w:val="a7"/>
+    <w:basedOn w:val="Normal"/>
+    <w:next w:val="Normal"/>
+    <w:link w:val="SubtitleChar"/>
     <w:uiPriority w:val="11"/>
     <w:qFormat/>
     <w:rsid w:val="00C057C7"/>
@@ -901,10 +972,10 @@
       <w:szCs w:val="28"/>
     </w:rPr>
   </w:style>
-  <w:style w:type="character" w:customStyle="1" w:styleId="a7">
-    <w:name w:val="Подзаголовок Знак"/>
-    <w:basedOn w:val="a1"/>
-    <w:link w:val="a6"/>
+  <w:style w:type="character" w:customStyle="1" w:styleId="SubtitleChar">
+    <w:name w:val="Subtitle Char"/>
+    <w:basedOn w:val="DefaultParagraphFont"/>
+    <w:link w:val="Subtitle"/>
     <w:uiPriority w:val="11"/>
     <w:rsid w:val="00C057C7"/>
     <w:rPr>
@@ -915,11 +986,11 @@
       <w:szCs w:val="28"/>
     </w:rPr>
   </w:style>
-  <w:style w:type="paragraph" w:styleId="21">
+  <w:style w:type="paragraph" w:styleId="Quote">
     <w:name w:val="Quote"/>
-    <w:basedOn w:val="a"/>
-    <w:next w:val="a"/>
-    <w:link w:val="22"/>
+    <w:basedOn w:val="Normal"/>
+    <w:next w:val="Normal"/>
+    <w:link w:val="QuoteChar"/>
     <w:uiPriority w:val="29"/>
     <w:qFormat/>
     <w:rsid w:val="00C057C7"/>
@@ -933,10 +1004,10 @@
       <w:color w:val="404040" w:themeColor="text1" w:themeTint="BF"/>
     </w:rPr>
   </w:style>
-  <w:style w:type="character" w:customStyle="1" w:styleId="22">
-    <w:name w:val="Цитата 2 Знак"/>
-    <w:basedOn w:val="a1"/>
-    <w:link w:val="21"/>
+  <w:style w:type="character" w:customStyle="1" w:styleId="QuoteChar">
+    <w:name w:val="Quote Char"/>
+    <w:basedOn w:val="DefaultParagraphFont"/>
+    <w:link w:val="Quote"/>
     <w:uiPriority w:val="29"/>
     <w:rsid w:val="00C057C7"/>
     <w:rPr>
@@ -945,9 +1016,9 @@
       <w:color w:val="404040" w:themeColor="text1" w:themeTint="BF"/>
     </w:rPr>
   </w:style>
-  <w:style w:type="paragraph" w:styleId="a8">
+  <w:style w:type="paragraph" w:styleId="ListParagraph">
     <w:name w:val="List Paragraph"/>
-    <w:basedOn w:val="a"/>
+    <w:basedOn w:val="Normal"/>
     <w:uiPriority w:val="34"/>
     <w:qFormat/>
     <w:rsid w:val="00C057C7"/>
@@ -956,9 +1027,9 @@
       <w:contextualSpacing/>
     </w:pPr>
   </w:style>
-  <w:style w:type="character" w:styleId="a9">
+  <w:style w:type="character" w:styleId="IntenseEmphasis">
     <w:name w:val="Intense Emphasis"/>
-    <w:basedOn w:val="a1"/>
+    <w:basedOn w:val="DefaultParagraphFont"/>
     <w:uiPriority w:val="21"/>
     <w:qFormat/>
     <w:rsid w:val="00C057C7"/>
@@ -968,11 +1039,11 @@
       <w:color w:val="0F4761" w:themeColor="accent1" w:themeShade="BF"/>
     </w:rPr>
   </w:style>
-  <w:style w:type="paragraph" w:styleId="aa">
+  <w:style w:type="paragraph" w:styleId="IntenseQuote">
     <w:name w:val="Intense Quote"/>
-    <w:basedOn w:val="a"/>
-    <w:next w:val="a"/>
-    <w:link w:val="ab"/>
+    <w:basedOn w:val="Normal"/>
+    <w:next w:val="Normal"/>
+    <w:link w:val="IntenseQuoteChar"/>
     <w:uiPriority w:val="30"/>
     <w:qFormat/>
     <w:rsid w:val="00C057C7"/>
@@ -991,10 +1062,10 @@
       <w:color w:val="0F4761" w:themeColor="accent1" w:themeShade="BF"/>
     </w:rPr>
   </w:style>
-  <w:style w:type="character" w:customStyle="1" w:styleId="ab">
-    <w:name w:val="Выделенная цитата Знак"/>
-    <w:basedOn w:val="a1"/>
-    <w:link w:val="aa"/>
+  <w:style w:type="character" w:customStyle="1" w:styleId="IntenseQuoteChar">
+    <w:name w:val="Intense Quote Char"/>
+    <w:basedOn w:val="DefaultParagraphFont"/>
+    <w:link w:val="IntenseQuote"/>
     <w:uiPriority w:val="30"/>
     <w:rsid w:val="00C057C7"/>
     <w:rPr>
@@ -1003,9 +1074,9 @@
       <w:color w:val="0F4761" w:themeColor="accent1" w:themeShade="BF"/>
     </w:rPr>
   </w:style>
-  <w:style w:type="character" w:styleId="ac">
+  <w:style w:type="character" w:styleId="IntenseReference">
     <w:name w:val="Intense Reference"/>
-    <w:basedOn w:val="a1"/>
+    <w:basedOn w:val="DefaultParagraphFont"/>
     <w:uiPriority w:val="32"/>
     <w:qFormat/>
     <w:rsid w:val="00C057C7"/>
@@ -1017,7 +1088,7 @@
       <w:spacing w:val="5"/>
     </w:rPr>
   </w:style>
-  <w:style w:type="paragraph" w:styleId="a0">
+  <w:style w:type="paragraph" w:styleId="NoSpacing">
     <w:name w:val="No Spacing"/>
     <w:uiPriority w:val="1"/>
     <w:qFormat/>
@@ -1027,9 +1098,9 @@
       <w:jc w:val="right"/>
     </w:pPr>
   </w:style>
-  <w:style w:type="character" w:styleId="ad">
+  <w:style w:type="character" w:styleId="Emphasis">
     <w:name w:val="Emphasis"/>
-    <w:basedOn w:val="a1"/>
+    <w:basedOn w:val="DefaultParagraphFont"/>
     <w:uiPriority w:val="20"/>
     <w:qFormat/>
     <w:rsid w:val="00B71F69"/>

</xml_diff>

<commit_message>
TC-58: Removing redundant functionality that should be separated into other tasks
</commit_message>
<xml_diff>
--- a/java-thesis-checker/src/test/resources/correct_structural_element_location.docx
+++ b/java-thesis-checker/src/test/resources/correct_structural_element_location.docx
@@ -3,162 +3,91 @@
 <w:document xmlns:wpc="http://schemas.microsoft.com/office/word/2010/wordprocessingCanvas" xmlns:cx="http://schemas.microsoft.com/office/drawing/2014/chartex" xmlns:cx1="http://schemas.microsoft.com/office/drawing/2015/9/8/chartex" xmlns:cx2="http://schemas.microsoft.com/office/drawing/2015/10/21/chartex" xmlns:cx3="http://schemas.microsoft.com/office/drawing/2016/5/9/chartex" xmlns:cx4="http://schemas.microsoft.com/office/drawing/2016/5/10/chartex" xmlns:cx5="http://schemas.microsoft.com/office/drawing/2016/5/11/chartex" xmlns:cx6="http://schemas.microsoft.com/office/drawing/2016/5/12/chartex" xmlns:cx7="http://schemas.microsoft.com/office/drawing/2016/5/13/chartex" xmlns:cx8="http://schemas.microsoft.com/office/drawing/2016/5/14/chartex" xmlns:mc="http://schemas.openxmlformats.org/markup-compatibility/2006" xmlns:aink="http://schemas.microsoft.com/office/drawing/2016/ink" xmlns:am3d="http://schemas.microsoft.com/office/drawing/2017/model3d" xmlns:o="urn:schemas-microsoft-com:office:office" xmlns:oel="http://schemas.microsoft.com/office/2019/extlst" xmlns:r="http://schemas.openxmlformats.org/officeDocument/2006/relationships" xmlns:m="http://schemas.openxmlformats.org/officeDocument/2006/math" xmlns:v="urn:schemas-microsoft-com:vml" xmlns:wp14="http://schemas.microsoft.com/office/word/2010/wordprocessingDrawing" xmlns:wp="http://schemas.openxmlformats.org/drawingml/2006/wordprocessingDrawing" xmlns:w10="urn:schemas-microsoft-com:office:word" xmlns:w="http://schemas.openxmlformats.org/wordprocessingml/2006/main" xmlns:w14="http://schemas.microsoft.com/office/word/2010/wordml" xmlns:w15="http://schemas.microsoft.com/office/word/2012/wordml" xmlns:w16cex="http://schemas.microsoft.com/office/word/2018/wordml/cex" xmlns:w16cid="http://schemas.microsoft.com/office/word/2016/wordml/cid" xmlns:w16="http://schemas.microsoft.com/office/word/2018/wordml" xmlns:w16du="http://schemas.microsoft.com/office/word/2023/wordml/word16du" xmlns:w16sdtdh="http://schemas.microsoft.com/office/word/2020/wordml/sdtdatahash" xmlns:w16sdtfl="http://schemas.microsoft.com/office/word/2024/wordml/sdtformatlock" xmlns:w16se="http://schemas.microsoft.com/office/word/2015/wordml/symex" xmlns:wpg="http://schemas.microsoft.com/office/word/2010/wordprocessingGroup" xmlns:wpi="http://schemas.microsoft.com/office/word/2010/wordprocessingInk" xmlns:wne="http://schemas.microsoft.com/office/word/2006/wordml" xmlns:wps="http://schemas.microsoft.com/office/word/2010/wordprocessingShape" mc:Ignorable="w14 w15 w16se w16cid w16 w16cex w16sdtdh w16sdtfl w16du wp14">
   <w:body>
     <w:p>
-      <w:pPr>
-        <w:jc w:val="center"/>
-        <w:rPr>
-          <w:b/>
-          <w:bCs/>
-        </w:rPr>
-      </w:pPr>
       <w:r>
-        <w:rPr>
-          <w:b/>
-          <w:bCs/>
-        </w:rPr>
-        <w:t>РЕФЕРАТ</w:t>
+        <w:t xml:space="preserve">РЕФЕРАТ</w:t>
       </w:r>
     </w:p>
     <w:p>
       <w:r>
-        <w:t>Стислий виклад роботи та її результатів.</w:t>
+        <w:t xml:space="preserve">Стислий виклад роботи та її результатів.</w:t>
       </w:r>
     </w:p>
     <w:p>
       <w:pPr>
         <w:pageBreakBefore/>
-        <w:jc w:val="center"/>
-        <w:rPr>
-          <w:b/>
-          <w:bCs/>
-        </w:rPr>
       </w:pPr>
       <w:r>
-        <w:rPr>
-          <w:b/>
-          <w:bCs/>
-        </w:rPr>
-        <w:lastRenderedPageBreak/>
-        <w:t>ЗМІСТ</w:t>
+        <w:t xml:space="preserve">ЗМІСТ</w:t>
       </w:r>
     </w:p>
     <w:p>
       <w:r>
-        <w:t>1. Вступ ... 2. Основна частина ... 3. Висновки ...</w:t>
+        <w:t xml:space="preserve">1. Вступ ... 2. Основна частина ... 3. Висновки ...</w:t>
       </w:r>
     </w:p>
     <w:p>
       <w:pPr>
         <w:pageBreakBefore/>
-        <w:jc w:val="center"/>
-        <w:rPr>
-          <w:b/>
-          <w:bCs/>
-        </w:rPr>
       </w:pPr>
       <w:r>
-        <w:rPr>
-          <w:b/>
-          <w:bCs/>
-        </w:rPr>
-        <w:lastRenderedPageBreak/>
-        <w:t>ПЕРЕЛІК ПОЗНАК ТА СКОРОЧЕНЬ</w:t>
+        <w:t xml:space="preserve">ПЕРЕЛІК ПОЗНАК ТА СКОРОЧЕНЬ</w:t>
       </w:r>
     </w:p>
     <w:p>
       <w:r>
-        <w:t>ПК – персональний комп'ютер.</w:t>
+        <w:t xml:space="preserve">ПК – персональний комп'ютер.</w:t>
       </w:r>
     </w:p>
     <w:p>
       <w:pPr>
         <w:pageBreakBefore/>
-        <w:jc w:val="center"/>
-        <w:rPr>
-          <w:b/>
-          <w:bCs/>
-        </w:rPr>
       </w:pPr>
       <w:r>
-        <w:rPr>
-          <w:b/>
-          <w:bCs/>
-        </w:rPr>
-        <w:lastRenderedPageBreak/>
-        <w:t>ВСТУП</w:t>
+        <w:t xml:space="preserve">ВСТУП</w:t>
       </w:r>
     </w:p>
     <w:p>
       <w:r>
-        <w:t>Актуальність теми роботи полягає у ...</w:t>
+        <w:t xml:space="preserve">Актуальність теми роботи полягає у ...</w:t>
       </w:r>
     </w:p>
     <w:p>
       <w:pPr>
         <w:pageBreakBefore/>
-        <w:jc w:val="center"/>
-        <w:rPr>
-          <w:b/>
-          <w:bCs/>
-        </w:rPr>
       </w:pPr>
       <w:r>
-        <w:rPr>
-          <w:b/>
-          <w:bCs/>
-        </w:rPr>
-        <w:lastRenderedPageBreak/>
-        <w:t>ВИСНОВКИ</w:t>
+        <w:t xml:space="preserve">ВИСНОВКИ</w:t>
       </w:r>
     </w:p>
     <w:p>
       <w:r>
-        <w:t>У результаті виконання роботи отримано ...</w:t>
+        <w:t xml:space="preserve">У результаті виконання роботи отримано ...</w:t>
       </w:r>
     </w:p>
     <w:p>
       <w:pPr>
         <w:pageBreakBefore/>
-        <w:jc w:val="center"/>
-        <w:rPr>
-          <w:b/>
-          <w:bCs/>
-        </w:rPr>
       </w:pPr>
       <w:r>
-        <w:rPr>
-          <w:b/>
-          <w:bCs/>
-        </w:rPr>
-        <w:lastRenderedPageBreak/>
-        <w:t>СПИСОК ДЖЕРЕЛ ІНФОРМАЦІЇ</w:t>
+        <w:t xml:space="preserve">СПИСОК ДЖЕРЕЛ ІНФОРМАЦІЇ</w:t>
       </w:r>
     </w:p>
     <w:p>
       <w:r>
-        <w:t>1. Автор. Назва джерела. Рік видання.</w:t>
+        <w:t xml:space="preserve">1. Автор. Назва джерела. Рік видання.</w:t>
       </w:r>
     </w:p>
     <w:p>
       <w:pPr>
         <w:pageBreakBefore/>
-        <w:jc w:val="center"/>
-        <w:rPr>
-          <w:b/>
-          <w:bCs/>
-        </w:rPr>
       </w:pPr>
       <w:r>
-        <w:rPr>
-          <w:b/>
-          <w:bCs/>
-        </w:rPr>
-        <w:lastRenderedPageBreak/>
-        <w:t>ДОДАТОК А</w:t>
+        <w:t xml:space="preserve">ДОДАТОК А</w:t>
       </w:r>
     </w:p>
     <w:p>
       <w:r>
-        <w:t>Текст додатка А.</w:t>
+        <w:t xml:space="preserve">Текст додатка А.</w:t>
       </w:r>
     </w:p>
     <w:sectPr>
@@ -180,7 +109,7 @@
         <w:kern w:val="2"/>
         <w:sz w:val="24"/>
         <w:szCs w:val="24"/>
-        <w:lang w:val="en-UA" w:eastAsia="en-US" w:bidi="ar-SA"/>
+        <w:lang w:val="ru-UA" w:eastAsia="en-US" w:bidi="ar-SA"/>
         <w14:ligatures w14:val="standardContextual"/>
       </w:rPr>
     </w:rPrDefault>
@@ -568,15 +497,15 @@
     <w:lsdException w:name="Unresolved Mention" w:semiHidden="1" w:unhideWhenUsed="1"/>
     <w:lsdException w:name="Smart Link" w:semiHidden="1" w:unhideWhenUsed="1"/>
   </w:latentStyles>
-  <w:style w:type="paragraph" w:default="1" w:styleId="Normal">
+  <w:style w:type="paragraph" w:default="1" w:styleId="a">
     <w:name w:val="Normal"/>
     <w:qFormat/>
   </w:style>
-  <w:style w:type="paragraph" w:styleId="Heading1">
+  <w:style w:type="paragraph" w:styleId="1">
     <w:name w:val="heading 1"/>
-    <w:basedOn w:val="NoSpacing"/>
-    <w:next w:val="Normal"/>
-    <w:link w:val="Heading1Char"/>
+    <w:basedOn w:val="a0"/>
+    <w:next w:val="a"/>
+    <w:link w:val="10"/>
     <w:uiPriority w:val="9"/>
     <w:qFormat/>
     <w:rsid w:val="00C057C7"/>
@@ -593,11 +522,11 @@
       <w:szCs w:val="40"/>
     </w:rPr>
   </w:style>
-  <w:style w:type="paragraph" w:styleId="Heading2">
+  <w:style w:type="paragraph" w:styleId="2">
     <w:name w:val="heading 2"/>
-    <w:basedOn w:val="Normal"/>
-    <w:next w:val="Normal"/>
-    <w:link w:val="Heading2Char"/>
+    <w:basedOn w:val="a"/>
+    <w:next w:val="a"/>
+    <w:link w:val="20"/>
     <w:uiPriority w:val="9"/>
     <w:semiHidden/>
     <w:unhideWhenUsed/>
@@ -616,11 +545,11 @@
       <w:szCs w:val="32"/>
     </w:rPr>
   </w:style>
-  <w:style w:type="paragraph" w:styleId="Heading3">
+  <w:style w:type="paragraph" w:styleId="3">
     <w:name w:val="heading 3"/>
-    <w:basedOn w:val="Normal"/>
-    <w:next w:val="Normal"/>
-    <w:link w:val="Heading3Char"/>
+    <w:basedOn w:val="a"/>
+    <w:next w:val="a"/>
+    <w:link w:val="30"/>
     <w:uiPriority w:val="9"/>
     <w:semiHidden/>
     <w:unhideWhenUsed/>
@@ -639,11 +568,11 @@
       <w:szCs w:val="28"/>
     </w:rPr>
   </w:style>
-  <w:style w:type="paragraph" w:styleId="Heading4">
+  <w:style w:type="paragraph" w:styleId="4">
     <w:name w:val="heading 4"/>
-    <w:basedOn w:val="Normal"/>
-    <w:next w:val="Normal"/>
-    <w:link w:val="Heading4Char"/>
+    <w:basedOn w:val="a"/>
+    <w:next w:val="a"/>
+    <w:link w:val="40"/>
     <w:uiPriority w:val="9"/>
     <w:semiHidden/>
     <w:unhideWhenUsed/>
@@ -662,11 +591,11 @@
       <w:color w:val="0F4761" w:themeColor="accent1" w:themeShade="BF"/>
     </w:rPr>
   </w:style>
-  <w:style w:type="paragraph" w:styleId="Heading5">
+  <w:style w:type="paragraph" w:styleId="5">
     <w:name w:val="heading 5"/>
-    <w:basedOn w:val="Normal"/>
-    <w:next w:val="Normal"/>
-    <w:link w:val="Heading5Char"/>
+    <w:basedOn w:val="a"/>
+    <w:next w:val="a"/>
+    <w:link w:val="50"/>
     <w:uiPriority w:val="9"/>
     <w:semiHidden/>
     <w:unhideWhenUsed/>
@@ -683,11 +612,11 @@
       <w:color w:val="0F4761" w:themeColor="accent1" w:themeShade="BF"/>
     </w:rPr>
   </w:style>
-  <w:style w:type="paragraph" w:styleId="Heading6">
+  <w:style w:type="paragraph" w:styleId="6">
     <w:name w:val="heading 6"/>
-    <w:basedOn w:val="Normal"/>
-    <w:next w:val="Normal"/>
-    <w:link w:val="Heading6Char"/>
+    <w:basedOn w:val="a"/>
+    <w:next w:val="a"/>
+    <w:link w:val="60"/>
     <w:uiPriority w:val="9"/>
     <w:semiHidden/>
     <w:unhideWhenUsed/>
@@ -706,11 +635,11 @@
       <w:color w:val="595959" w:themeColor="text1" w:themeTint="A6"/>
     </w:rPr>
   </w:style>
-  <w:style w:type="paragraph" w:styleId="Heading7">
+  <w:style w:type="paragraph" w:styleId="7">
     <w:name w:val="heading 7"/>
-    <w:basedOn w:val="Normal"/>
-    <w:next w:val="Normal"/>
-    <w:link w:val="Heading7Char"/>
+    <w:basedOn w:val="a"/>
+    <w:next w:val="a"/>
+    <w:link w:val="70"/>
     <w:uiPriority w:val="9"/>
     <w:semiHidden/>
     <w:unhideWhenUsed/>
@@ -727,11 +656,11 @@
       <w:color w:val="595959" w:themeColor="text1" w:themeTint="A6"/>
     </w:rPr>
   </w:style>
-  <w:style w:type="paragraph" w:styleId="Heading8">
+  <w:style w:type="paragraph" w:styleId="8">
     <w:name w:val="heading 8"/>
-    <w:basedOn w:val="Normal"/>
-    <w:next w:val="Normal"/>
-    <w:link w:val="Heading8Char"/>
+    <w:basedOn w:val="a"/>
+    <w:next w:val="a"/>
+    <w:link w:val="80"/>
     <w:uiPriority w:val="9"/>
     <w:semiHidden/>
     <w:unhideWhenUsed/>
@@ -750,11 +679,11 @@
       <w:color w:val="272727" w:themeColor="text1" w:themeTint="D8"/>
     </w:rPr>
   </w:style>
-  <w:style w:type="paragraph" w:styleId="Heading9">
+  <w:style w:type="paragraph" w:styleId="9">
     <w:name w:val="heading 9"/>
-    <w:basedOn w:val="Normal"/>
-    <w:next w:val="Normal"/>
-    <w:link w:val="Heading9Char"/>
+    <w:basedOn w:val="a"/>
+    <w:next w:val="a"/>
+    <w:link w:val="90"/>
     <w:uiPriority w:val="9"/>
     <w:semiHidden/>
     <w:unhideWhenUsed/>
@@ -771,13 +700,13 @@
       <w:color w:val="272727" w:themeColor="text1" w:themeTint="D8"/>
     </w:rPr>
   </w:style>
-  <w:style w:type="character" w:default="1" w:styleId="DefaultParagraphFont">
+  <w:style w:type="character" w:default="1" w:styleId="a1">
     <w:name w:val="Default Paragraph Font"/>
     <w:uiPriority w:val="1"/>
     <w:semiHidden/>
     <w:unhideWhenUsed/>
   </w:style>
-  <w:style w:type="table" w:default="1" w:styleId="TableNormal">
+  <w:style w:type="table" w:default="1" w:styleId="a2">
     <w:name w:val="Normal Table"/>
     <w:uiPriority w:val="99"/>
     <w:semiHidden/>
@@ -792,16 +721,16 @@
       </w:tblCellMar>
     </w:tblPr>
   </w:style>
-  <w:style w:type="numbering" w:default="1" w:styleId="NoList">
+  <w:style w:type="numbering" w:default="1" w:styleId="a3">
     <w:name w:val="No List"/>
     <w:uiPriority w:val="99"/>
     <w:semiHidden/>
     <w:unhideWhenUsed/>
   </w:style>
-  <w:style w:type="character" w:customStyle="1" w:styleId="Heading1Char">
-    <w:name w:val="Heading 1 Char"/>
-    <w:basedOn w:val="DefaultParagraphFont"/>
-    <w:link w:val="Heading1"/>
+  <w:style w:type="character" w:customStyle="1" w:styleId="10">
+    <w:name w:val="Заголовок 1 Знак"/>
+    <w:basedOn w:val="a1"/>
+    <w:link w:val="1"/>
     <w:uiPriority w:val="9"/>
     <w:rsid w:val="00C057C7"/>
     <w:rPr>
@@ -811,10 +740,10 @@
       <w:szCs w:val="40"/>
     </w:rPr>
   </w:style>
-  <w:style w:type="character" w:customStyle="1" w:styleId="Heading2Char">
-    <w:name w:val="Heading 2 Char"/>
-    <w:basedOn w:val="DefaultParagraphFont"/>
-    <w:link w:val="Heading2"/>
+  <w:style w:type="character" w:customStyle="1" w:styleId="20">
+    <w:name w:val="Заголовок 2 Знак"/>
+    <w:basedOn w:val="a1"/>
+    <w:link w:val="2"/>
     <w:uiPriority w:val="9"/>
     <w:semiHidden/>
     <w:rsid w:val="00C057C7"/>
@@ -825,10 +754,10 @@
       <w:szCs w:val="32"/>
     </w:rPr>
   </w:style>
-  <w:style w:type="character" w:customStyle="1" w:styleId="Heading3Char">
-    <w:name w:val="Heading 3 Char"/>
-    <w:basedOn w:val="DefaultParagraphFont"/>
-    <w:link w:val="Heading3"/>
+  <w:style w:type="character" w:customStyle="1" w:styleId="30">
+    <w:name w:val="Заголовок 3 Знак"/>
+    <w:basedOn w:val="a1"/>
+    <w:link w:val="3"/>
     <w:uiPriority w:val="9"/>
     <w:semiHidden/>
     <w:rsid w:val="00C057C7"/>
@@ -839,10 +768,10 @@
       <w:szCs w:val="28"/>
     </w:rPr>
   </w:style>
-  <w:style w:type="character" w:customStyle="1" w:styleId="Heading4Char">
-    <w:name w:val="Heading 4 Char"/>
-    <w:basedOn w:val="DefaultParagraphFont"/>
-    <w:link w:val="Heading4"/>
+  <w:style w:type="character" w:customStyle="1" w:styleId="40">
+    <w:name w:val="Заголовок 4 Знак"/>
+    <w:basedOn w:val="a1"/>
+    <w:link w:val="4"/>
     <w:uiPriority w:val="9"/>
     <w:semiHidden/>
     <w:rsid w:val="00C057C7"/>
@@ -853,10 +782,10 @@
       <w:color w:val="0F4761" w:themeColor="accent1" w:themeShade="BF"/>
     </w:rPr>
   </w:style>
-  <w:style w:type="character" w:customStyle="1" w:styleId="Heading5Char">
-    <w:name w:val="Heading 5 Char"/>
-    <w:basedOn w:val="DefaultParagraphFont"/>
-    <w:link w:val="Heading5"/>
+  <w:style w:type="character" w:customStyle="1" w:styleId="50">
+    <w:name w:val="Заголовок 5 Знак"/>
+    <w:basedOn w:val="a1"/>
+    <w:link w:val="5"/>
     <w:uiPriority w:val="9"/>
     <w:semiHidden/>
     <w:rsid w:val="00C057C7"/>
@@ -865,10 +794,10 @@
       <w:color w:val="0F4761" w:themeColor="accent1" w:themeShade="BF"/>
     </w:rPr>
   </w:style>
-  <w:style w:type="character" w:customStyle="1" w:styleId="Heading6Char">
-    <w:name w:val="Heading 6 Char"/>
-    <w:basedOn w:val="DefaultParagraphFont"/>
-    <w:link w:val="Heading6"/>
+  <w:style w:type="character" w:customStyle="1" w:styleId="60">
+    <w:name w:val="Заголовок 6 Знак"/>
+    <w:basedOn w:val="a1"/>
+    <w:link w:val="6"/>
     <w:uiPriority w:val="9"/>
     <w:semiHidden/>
     <w:rsid w:val="00C057C7"/>
@@ -879,10 +808,10 @@
       <w:color w:val="595959" w:themeColor="text1" w:themeTint="A6"/>
     </w:rPr>
   </w:style>
-  <w:style w:type="character" w:customStyle="1" w:styleId="Heading7Char">
-    <w:name w:val="Heading 7 Char"/>
-    <w:basedOn w:val="DefaultParagraphFont"/>
-    <w:link w:val="Heading7"/>
+  <w:style w:type="character" w:customStyle="1" w:styleId="70">
+    <w:name w:val="Заголовок 7 Знак"/>
+    <w:basedOn w:val="a1"/>
+    <w:link w:val="7"/>
     <w:uiPriority w:val="9"/>
     <w:semiHidden/>
     <w:rsid w:val="00C057C7"/>
@@ -891,10 +820,10 @@
       <w:color w:val="595959" w:themeColor="text1" w:themeTint="A6"/>
     </w:rPr>
   </w:style>
-  <w:style w:type="character" w:customStyle="1" w:styleId="Heading8Char">
-    <w:name w:val="Heading 8 Char"/>
-    <w:basedOn w:val="DefaultParagraphFont"/>
-    <w:link w:val="Heading8"/>
+  <w:style w:type="character" w:customStyle="1" w:styleId="80">
+    <w:name w:val="Заголовок 8 Знак"/>
+    <w:basedOn w:val="a1"/>
+    <w:link w:val="8"/>
     <w:uiPriority w:val="9"/>
     <w:semiHidden/>
     <w:rsid w:val="00C057C7"/>
@@ -905,10 +834,10 @@
       <w:color w:val="272727" w:themeColor="text1" w:themeTint="D8"/>
     </w:rPr>
   </w:style>
-  <w:style w:type="character" w:customStyle="1" w:styleId="Heading9Char">
-    <w:name w:val="Heading 9 Char"/>
-    <w:basedOn w:val="DefaultParagraphFont"/>
-    <w:link w:val="Heading9"/>
+  <w:style w:type="character" w:customStyle="1" w:styleId="90">
+    <w:name w:val="Заголовок 9 Знак"/>
+    <w:basedOn w:val="a1"/>
+    <w:link w:val="9"/>
     <w:uiPriority w:val="9"/>
     <w:semiHidden/>
     <w:rsid w:val="00C057C7"/>
@@ -917,11 +846,11 @@
       <w:color w:val="272727" w:themeColor="text1" w:themeTint="D8"/>
     </w:rPr>
   </w:style>
-  <w:style w:type="paragraph" w:styleId="Title">
+  <w:style w:type="paragraph" w:styleId="a4">
     <w:name w:val="Title"/>
-    <w:basedOn w:val="Normal"/>
-    <w:next w:val="Normal"/>
-    <w:link w:val="TitleChar"/>
+    <w:basedOn w:val="a"/>
+    <w:next w:val="a"/>
+    <w:link w:val="a5"/>
     <w:uiPriority w:val="10"/>
     <w:qFormat/>
     <w:rsid w:val="00C057C7"/>
@@ -937,10 +866,10 @@
       <w:szCs w:val="56"/>
     </w:rPr>
   </w:style>
-  <w:style w:type="character" w:customStyle="1" w:styleId="TitleChar">
-    <w:name w:val="Title Char"/>
-    <w:basedOn w:val="DefaultParagraphFont"/>
-    <w:link w:val="Title"/>
+  <w:style w:type="character" w:customStyle="1" w:styleId="a5">
+    <w:name w:val="Заголовок Знак"/>
+    <w:basedOn w:val="a1"/>
+    <w:link w:val="a4"/>
     <w:uiPriority w:val="10"/>
     <w:rsid w:val="00C057C7"/>
     <w:rPr>
@@ -951,11 +880,11 @@
       <w:szCs w:val="56"/>
     </w:rPr>
   </w:style>
-  <w:style w:type="paragraph" w:styleId="Subtitle">
+  <w:style w:type="paragraph" w:styleId="a6">
     <w:name w:val="Subtitle"/>
-    <w:basedOn w:val="Normal"/>
-    <w:next w:val="Normal"/>
-    <w:link w:val="SubtitleChar"/>
+    <w:basedOn w:val="a"/>
+    <w:next w:val="a"/>
+    <w:link w:val="a7"/>
     <w:uiPriority w:val="11"/>
     <w:qFormat/>
     <w:rsid w:val="00C057C7"/>
@@ -972,10 +901,10 @@
       <w:szCs w:val="28"/>
     </w:rPr>
   </w:style>
-  <w:style w:type="character" w:customStyle="1" w:styleId="SubtitleChar">
-    <w:name w:val="Subtitle Char"/>
-    <w:basedOn w:val="DefaultParagraphFont"/>
-    <w:link w:val="Subtitle"/>
+  <w:style w:type="character" w:customStyle="1" w:styleId="a7">
+    <w:name w:val="Подзаголовок Знак"/>
+    <w:basedOn w:val="a1"/>
+    <w:link w:val="a6"/>
     <w:uiPriority w:val="11"/>
     <w:rsid w:val="00C057C7"/>
     <w:rPr>
@@ -986,11 +915,11 @@
       <w:szCs w:val="28"/>
     </w:rPr>
   </w:style>
-  <w:style w:type="paragraph" w:styleId="Quote">
+  <w:style w:type="paragraph" w:styleId="21">
     <w:name w:val="Quote"/>
-    <w:basedOn w:val="Normal"/>
-    <w:next w:val="Normal"/>
-    <w:link w:val="QuoteChar"/>
+    <w:basedOn w:val="a"/>
+    <w:next w:val="a"/>
+    <w:link w:val="22"/>
     <w:uiPriority w:val="29"/>
     <w:qFormat/>
     <w:rsid w:val="00C057C7"/>
@@ -1004,10 +933,10 @@
       <w:color w:val="404040" w:themeColor="text1" w:themeTint="BF"/>
     </w:rPr>
   </w:style>
-  <w:style w:type="character" w:customStyle="1" w:styleId="QuoteChar">
-    <w:name w:val="Quote Char"/>
-    <w:basedOn w:val="DefaultParagraphFont"/>
-    <w:link w:val="Quote"/>
+  <w:style w:type="character" w:customStyle="1" w:styleId="22">
+    <w:name w:val="Цитата 2 Знак"/>
+    <w:basedOn w:val="a1"/>
+    <w:link w:val="21"/>
     <w:uiPriority w:val="29"/>
     <w:rsid w:val="00C057C7"/>
     <w:rPr>
@@ -1016,9 +945,9 @@
       <w:color w:val="404040" w:themeColor="text1" w:themeTint="BF"/>
     </w:rPr>
   </w:style>
-  <w:style w:type="paragraph" w:styleId="ListParagraph">
+  <w:style w:type="paragraph" w:styleId="a8">
     <w:name w:val="List Paragraph"/>
-    <w:basedOn w:val="Normal"/>
+    <w:basedOn w:val="a"/>
     <w:uiPriority w:val="34"/>
     <w:qFormat/>
     <w:rsid w:val="00C057C7"/>
@@ -1027,9 +956,9 @@
       <w:contextualSpacing/>
     </w:pPr>
   </w:style>
-  <w:style w:type="character" w:styleId="IntenseEmphasis">
+  <w:style w:type="character" w:styleId="a9">
     <w:name w:val="Intense Emphasis"/>
-    <w:basedOn w:val="DefaultParagraphFont"/>
+    <w:basedOn w:val="a1"/>
     <w:uiPriority w:val="21"/>
     <w:qFormat/>
     <w:rsid w:val="00C057C7"/>
@@ -1039,11 +968,11 @@
       <w:color w:val="0F4761" w:themeColor="accent1" w:themeShade="BF"/>
     </w:rPr>
   </w:style>
-  <w:style w:type="paragraph" w:styleId="IntenseQuote">
+  <w:style w:type="paragraph" w:styleId="aa">
     <w:name w:val="Intense Quote"/>
-    <w:basedOn w:val="Normal"/>
-    <w:next w:val="Normal"/>
-    <w:link w:val="IntenseQuoteChar"/>
+    <w:basedOn w:val="a"/>
+    <w:next w:val="a"/>
+    <w:link w:val="ab"/>
     <w:uiPriority w:val="30"/>
     <w:qFormat/>
     <w:rsid w:val="00C057C7"/>
@@ -1062,10 +991,10 @@
       <w:color w:val="0F4761" w:themeColor="accent1" w:themeShade="BF"/>
     </w:rPr>
   </w:style>
-  <w:style w:type="character" w:customStyle="1" w:styleId="IntenseQuoteChar">
-    <w:name w:val="Intense Quote Char"/>
-    <w:basedOn w:val="DefaultParagraphFont"/>
-    <w:link w:val="IntenseQuote"/>
+  <w:style w:type="character" w:customStyle="1" w:styleId="ab">
+    <w:name w:val="Выделенная цитата Знак"/>
+    <w:basedOn w:val="a1"/>
+    <w:link w:val="aa"/>
     <w:uiPriority w:val="30"/>
     <w:rsid w:val="00C057C7"/>
     <w:rPr>
@@ -1074,9 +1003,9 @@
       <w:color w:val="0F4761" w:themeColor="accent1" w:themeShade="BF"/>
     </w:rPr>
   </w:style>
-  <w:style w:type="character" w:styleId="IntenseReference">
+  <w:style w:type="character" w:styleId="ac">
     <w:name w:val="Intense Reference"/>
-    <w:basedOn w:val="DefaultParagraphFont"/>
+    <w:basedOn w:val="a1"/>
     <w:uiPriority w:val="32"/>
     <w:qFormat/>
     <w:rsid w:val="00C057C7"/>
@@ -1088,7 +1017,7 @@
       <w:spacing w:val="5"/>
     </w:rPr>
   </w:style>
-  <w:style w:type="paragraph" w:styleId="NoSpacing">
+  <w:style w:type="paragraph" w:styleId="a0">
     <w:name w:val="No Spacing"/>
     <w:uiPriority w:val="1"/>
     <w:qFormat/>
@@ -1098,9 +1027,9 @@
       <w:jc w:val="right"/>
     </w:pPr>
   </w:style>
-  <w:style w:type="character" w:styleId="Emphasis">
+  <w:style w:type="character" w:styleId="ad">
     <w:name w:val="Emphasis"/>
-    <w:basedOn w:val="DefaultParagraphFont"/>
+    <w:basedOn w:val="a1"/>
     <w:uiPriority w:val="20"/>
     <w:qFormat/>
     <w:rsid w:val="00B71F69"/>

</xml_diff>